<commit_message>
Record current part one Word package copies
</commit_message>
<xml_diff>
--- a/최종_게시_패키지/01_블로그용_Word/문병로_교수의_메트릭_스튜디오_02_01_블로그_게시용_최종본.docx
+++ b/최종_게시_패키지/01_블로그용_Word/문병로_교수의_메트릭_스튜디오_02_01_블로그_게시용_최종본.docx
@@ -2447,6 +2447,985 @@
         <w:pStyle w:val="Heading2"/>
       </w:pPr>
       <w:r>
+        <w:t>손절매는 손실을 막는 규칙인가, 손실 경로를 바꾸는 규칙인가</w:t>
+      </w:r>
+    </w:p>
+    <w:p>
+      <w:pPr>
+        <w:spacing w:after="160" w:line="320" w:lineRule="auto"/>
+      </w:pPr>
+      <w:r>
+        <w:rPr>
+          <w:rFonts w:ascii="Malgun Gothic" w:hAnsi="Malgun Gothic" w:eastAsia="Malgun Gothic"/>
+          <w:sz w:val="22"/>
+        </w:rPr>
+        <w:t>손절매는 이 글의 유동성 문제와 멀어 보이지만, 실제로는 같은 질문에 닿아 있다. 손절은 가격이 내려가면 위험을 줄이는 규칙처럼 보인다. 그러나 저유동성 종목에서 손절 주문은 가장 거래하기 어려운 순간에 나간다. 손실을 줄였다고 기록한 백테스트가 실제로는 더 큰 가격 양보와 미체결을 숨길 수 있다. 그래서 손절을 ‘수익률을 높이는 보조 신호’로 바로 넣지 않고, 손실이 난 뒤 현금 비중과 회복 가능성이 어떻게 바뀌는지부터 확인했다.</w:t>
+      </w:r>
+    </w:p>
+    <w:p>
+      <w:pPr>
+        <w:spacing w:after="160" w:line="320" w:lineRule="auto"/>
+      </w:pPr>
+      <w:r>
+        <w:rPr>
+          <w:rFonts w:ascii="Malgun Gothic" w:hAnsi="Malgun Gothic" w:eastAsia="Malgun Gothic"/>
+          <w:sz w:val="22"/>
+        </w:rPr>
+        <w:t xml:space="preserve">현재 원천 데이터에는 일별 수정주가는 있지만 장중 고가·저가, 호가 스프레드, 실제 주문 체결 정보는 없다. 따라서 ‘-10%에 닿는 즉시 -10%에서 체결’되는 손절은 이 데이터로 검증할 수 없다. 그런 숫자는 손절 규칙이 아니라 체결가를 임의로 만든 결과가 된다. 이번에는 더 보수적으로, 월말에 선택한 소형주를 일별 종가로 추적하다가 손실 기준을 처음 넘긴 뒤 </w:t>
+      </w:r>
+      <w:r>
+        <w:rPr>
+          <w:rFonts w:ascii="Malgun Gothic" w:hAnsi="Malgun Gothic" w:eastAsia="Malgun Gothic"/>
+          <w:b/>
+          <w:sz w:val="22"/>
+        </w:rPr>
+        <w:t>다음 거래일 종가</w:t>
+      </w:r>
+      <w:r>
+        <w:rPr>
+          <w:rFonts w:ascii="Malgun Gothic" w:hAnsi="Malgun Gothic" w:eastAsia="Malgun Gothic"/>
+          <w:sz w:val="22"/>
+        </w:rPr>
+        <w:t>에 청산하고, 다음 월 리밸런싱까지 현금으로 두는 규칙만 계산했다.</w:t>
+      </w:r>
+    </w:p>
+    <w:p>
+      <w:pPr>
+        <w:spacing w:after="160" w:line="320" w:lineRule="auto"/>
+      </w:pPr>
+      <w:r>
+        <w:rPr>
+          <w:rFonts w:ascii="Malgun Gothic" w:hAnsi="Malgun Gothic" w:eastAsia="Malgun Gothic"/>
+          <w:sz w:val="22"/>
+        </w:rPr>
+        <w:t>비교 대상은 앞에서 나온 비용 차감 포트폴리오 전체가 아니다. 선택된 소형주 보유 종목 중 형성일과 다음 형성일의 일별 수정주가가 모두 확인되는 15,464개 보유-월을 동일가중으로 비교한 조건부 표본이다. 체결 용량과 거래비용은 이 비교에서 고정하지 못했다. 이 실험은 ‘손절을 적용하면 실전 수익률이 얼마다’를 말하는 것이 아니라, 동일한 보유 종목 경로에서 손절 기준이 수익과 손실의 분포를 어떤 방향으로 바꾸는지 보는 오버레이다.</w:t>
+      </w:r>
+    </w:p>
+    <w:tbl>
+      <w:tblPr>
+        <w:tblW w:type="auto" w:w="0"/>
+        <w:jc w:val="center"/>
+        <w:tblLayout w:type="fixed"/>
+        <w:tblLook w:firstColumn="1" w:firstRow="1" w:lastColumn="0" w:lastRow="0" w:noHBand="0" w:noVBand="1" w:val="04A0"/>
+      </w:tblPr>
+      <w:tblGrid>
+        <w:gridCol w:w="1560"/>
+        <w:gridCol w:w="1560"/>
+        <w:gridCol w:w="1560"/>
+        <w:gridCol w:w="1560"/>
+        <w:gridCol w:w="1560"/>
+        <w:gridCol w:w="1560"/>
+      </w:tblGrid>
+      <w:tr>
+        <w:tc>
+          <w:tcPr>
+            <w:tcW w:type="dxa" w:w="1476"/>
+            <w:tcMar>
+              <w:top w:w="80" w:type="dxa"/>
+              <w:start w:w="120" w:type="dxa"/>
+              <w:bottom w:w="80" w:type="dxa"/>
+              <w:end w:w="120" w:type="dxa"/>
+            </w:tcMar>
+            <w:vAlign w:val="center"/>
+            <w:shd w:fill="F2F4F7"/>
+          </w:tcPr>
+          <w:p>
+            <w:pPr>
+              <w:spacing w:after="0"/>
+              <w:jc w:val="left"/>
+            </w:pPr>
+            <w:r>
+              <w:rPr>
+                <w:rFonts w:ascii="Malgun Gothic" w:hAnsi="Malgun Gothic" w:eastAsia="Malgun Gothic"/>
+                <w:b/>
+                <w:sz w:val="20"/>
+              </w:rPr>
+              <w:t>규칙</w:t>
+            </w:r>
+          </w:p>
+        </w:tc>
+        <w:tc>
+          <w:tcPr>
+            <w:tcW w:type="dxa" w:w="1476"/>
+            <w:tcMar>
+              <w:top w:w="80" w:type="dxa"/>
+              <w:start w:w="120" w:type="dxa"/>
+              <w:bottom w:w="80" w:type="dxa"/>
+              <w:end w:w="120" w:type="dxa"/>
+            </w:tcMar>
+            <w:vAlign w:val="center"/>
+            <w:shd w:fill="F2F4F7"/>
+          </w:tcPr>
+          <w:p>
+            <w:pPr>
+              <w:spacing w:after="0"/>
+              <w:jc w:val="center"/>
+            </w:pPr>
+            <w:r>
+              <w:rPr>
+                <w:rFonts w:ascii="Malgun Gothic" w:hAnsi="Malgun Gothic" w:eastAsia="Malgun Gothic"/>
+                <w:b/>
+                <w:sz w:val="20"/>
+              </w:rPr>
+              <w:t>CAGR</w:t>
+            </w:r>
+          </w:p>
+        </w:tc>
+        <w:tc>
+          <w:tcPr>
+            <w:tcW w:type="dxa" w:w="1476"/>
+            <w:tcMar>
+              <w:top w:w="80" w:type="dxa"/>
+              <w:start w:w="120" w:type="dxa"/>
+              <w:bottom w:w="80" w:type="dxa"/>
+              <w:end w:w="120" w:type="dxa"/>
+            </w:tcMar>
+            <w:vAlign w:val="center"/>
+            <w:shd w:fill="F2F4F7"/>
+          </w:tcPr>
+          <w:p>
+            <w:pPr>
+              <w:spacing w:after="0"/>
+              <w:jc w:val="center"/>
+            </w:pPr>
+            <w:r>
+              <w:rPr>
+                <w:rFonts w:ascii="Malgun Gothic" w:hAnsi="Malgun Gothic" w:eastAsia="Malgun Gothic"/>
+                <w:b/>
+                <w:sz w:val="20"/>
+              </w:rPr>
+              <w:t>MDD</w:t>
+            </w:r>
+          </w:p>
+        </w:tc>
+        <w:tc>
+          <w:tcPr>
+            <w:tcW w:type="dxa" w:w="1476"/>
+            <w:tcMar>
+              <w:top w:w="80" w:type="dxa"/>
+              <w:start w:w="120" w:type="dxa"/>
+              <w:bottom w:w="80" w:type="dxa"/>
+              <w:end w:w="120" w:type="dxa"/>
+            </w:tcMar>
+            <w:vAlign w:val="center"/>
+            <w:shd w:fill="F2F4F7"/>
+          </w:tcPr>
+          <w:p>
+            <w:pPr>
+              <w:spacing w:after="0"/>
+              <w:jc w:val="center"/>
+            </w:pPr>
+            <w:r>
+              <w:rPr>
+                <w:rFonts w:ascii="Malgun Gothic" w:hAnsi="Malgun Gothic" w:eastAsia="Malgun Gothic"/>
+                <w:b/>
+                <w:sz w:val="20"/>
+              </w:rPr>
+              <w:t>월별 t-통계량</w:t>
+            </w:r>
+          </w:p>
+        </w:tc>
+        <w:tc>
+          <w:tcPr>
+            <w:tcW w:type="dxa" w:w="1476"/>
+            <w:tcMar>
+              <w:top w:w="80" w:type="dxa"/>
+              <w:start w:w="120" w:type="dxa"/>
+              <w:bottom w:w="80" w:type="dxa"/>
+              <w:end w:w="120" w:type="dxa"/>
+            </w:tcMar>
+            <w:vAlign w:val="center"/>
+            <w:shd w:fill="F2F4F7"/>
+          </w:tcPr>
+          <w:p>
+            <w:pPr>
+              <w:spacing w:after="0"/>
+              <w:jc w:val="center"/>
+            </w:pPr>
+            <w:r>
+              <w:rPr>
+                <w:rFonts w:ascii="Malgun Gothic" w:hAnsi="Malgun Gothic" w:eastAsia="Malgun Gothic"/>
+                <w:b/>
+                <w:sz w:val="20"/>
+              </w:rPr>
+              <w:t>손절 발생 비율</w:t>
+            </w:r>
+          </w:p>
+        </w:tc>
+        <w:tc>
+          <w:tcPr>
+            <w:tcW w:type="dxa" w:w="1476"/>
+            <w:tcMar>
+              <w:top w:w="80" w:type="dxa"/>
+              <w:start w:w="120" w:type="dxa"/>
+              <w:bottom w:w="80" w:type="dxa"/>
+              <w:end w:w="120" w:type="dxa"/>
+            </w:tcMar>
+            <w:vAlign w:val="center"/>
+            <w:shd w:fill="F2F4F7"/>
+          </w:tcPr>
+          <w:p>
+            <w:pPr>
+              <w:spacing w:after="0"/>
+              <w:jc w:val="center"/>
+            </w:pPr>
+            <w:r>
+              <w:rPr>
+                <w:rFonts w:ascii="Malgun Gothic" w:hAnsi="Malgun Gothic" w:eastAsia="Malgun Gothic"/>
+                <w:b/>
+                <w:sz w:val="20"/>
+              </w:rPr>
+              <w:t>손절 뒤 월말 회복 비율</w:t>
+            </w:r>
+          </w:p>
+        </w:tc>
+      </w:tr>
+      <w:tr>
+        <w:tc>
+          <w:tcPr>
+            <w:tcW w:type="dxa" w:w="1476"/>
+            <w:tcMar>
+              <w:top w:w="80" w:type="dxa"/>
+              <w:start w:w="120" w:type="dxa"/>
+              <w:bottom w:w="80" w:type="dxa"/>
+              <w:end w:w="120" w:type="dxa"/>
+            </w:tcMar>
+            <w:vAlign w:val="center"/>
+          </w:tcPr>
+          <w:p>
+            <w:pPr>
+              <w:spacing w:after="0"/>
+              <w:jc w:val="left"/>
+            </w:pPr>
+            <w:r>
+              <w:rPr>
+                <w:rFonts w:ascii="Malgun Gothic" w:hAnsi="Malgun Gothic" w:eastAsia="Malgun Gothic"/>
+                <w:b w:val="0"/>
+                <w:sz w:val="20"/>
+              </w:rPr>
+              <w:t>손절 없음</w:t>
+            </w:r>
+          </w:p>
+        </w:tc>
+        <w:tc>
+          <w:tcPr>
+            <w:tcW w:type="dxa" w:w="1476"/>
+            <w:tcMar>
+              <w:top w:w="80" w:type="dxa"/>
+              <w:start w:w="120" w:type="dxa"/>
+              <w:bottom w:w="80" w:type="dxa"/>
+              <w:end w:w="120" w:type="dxa"/>
+            </w:tcMar>
+            <w:vAlign w:val="center"/>
+          </w:tcPr>
+          <w:p>
+            <w:pPr>
+              <w:spacing w:after="0"/>
+              <w:jc w:val="center"/>
+            </w:pPr>
+            <w:r>
+              <w:rPr>
+                <w:rFonts w:ascii="Malgun Gothic" w:hAnsi="Malgun Gothic" w:eastAsia="Malgun Gothic"/>
+                <w:b w:val="0"/>
+                <w:sz w:val="20"/>
+              </w:rPr>
+              <w:t>47.3%</w:t>
+            </w:r>
+          </w:p>
+        </w:tc>
+        <w:tc>
+          <w:tcPr>
+            <w:tcW w:type="dxa" w:w="1476"/>
+            <w:tcMar>
+              <w:top w:w="80" w:type="dxa"/>
+              <w:start w:w="120" w:type="dxa"/>
+              <w:bottom w:w="80" w:type="dxa"/>
+              <w:end w:w="120" w:type="dxa"/>
+            </w:tcMar>
+            <w:vAlign w:val="center"/>
+          </w:tcPr>
+          <w:p>
+            <w:pPr>
+              <w:spacing w:after="0"/>
+              <w:jc w:val="center"/>
+            </w:pPr>
+            <w:r>
+              <w:rPr>
+                <w:rFonts w:ascii="Malgun Gothic" w:hAnsi="Malgun Gothic" w:eastAsia="Malgun Gothic"/>
+                <w:b w:val="0"/>
+                <w:sz w:val="20"/>
+              </w:rPr>
+              <w:t>-49.8%</w:t>
+            </w:r>
+          </w:p>
+        </w:tc>
+        <w:tc>
+          <w:tcPr>
+            <w:tcW w:type="dxa" w:w="1476"/>
+            <w:tcMar>
+              <w:top w:w="80" w:type="dxa"/>
+              <w:start w:w="120" w:type="dxa"/>
+              <w:bottom w:w="80" w:type="dxa"/>
+              <w:end w:w="120" w:type="dxa"/>
+            </w:tcMar>
+            <w:vAlign w:val="center"/>
+          </w:tcPr>
+          <w:p>
+            <w:pPr>
+              <w:spacing w:after="0"/>
+              <w:jc w:val="center"/>
+            </w:pPr>
+            <w:r>
+              <w:rPr>
+                <w:rFonts w:ascii="Malgun Gothic" w:hAnsi="Malgun Gothic" w:eastAsia="Malgun Gothic"/>
+                <w:b w:val="0"/>
+                <w:sz w:val="20"/>
+              </w:rPr>
+              <w:t>6.28</w:t>
+            </w:r>
+          </w:p>
+        </w:tc>
+        <w:tc>
+          <w:tcPr>
+            <w:tcW w:type="dxa" w:w="1476"/>
+            <w:tcMar>
+              <w:top w:w="80" w:type="dxa"/>
+              <w:start w:w="120" w:type="dxa"/>
+              <w:bottom w:w="80" w:type="dxa"/>
+              <w:end w:w="120" w:type="dxa"/>
+            </w:tcMar>
+            <w:vAlign w:val="center"/>
+          </w:tcPr>
+          <w:p>
+            <w:pPr>
+              <w:spacing w:after="0"/>
+              <w:jc w:val="center"/>
+            </w:pPr>
+            <w:r>
+              <w:rPr>
+                <w:rFonts w:ascii="Malgun Gothic" w:hAnsi="Malgun Gothic" w:eastAsia="Malgun Gothic"/>
+                <w:b w:val="0"/>
+                <w:sz w:val="20"/>
+              </w:rPr>
+              <w:t>-</w:t>
+            </w:r>
+          </w:p>
+        </w:tc>
+        <w:tc>
+          <w:tcPr>
+            <w:tcW w:type="dxa" w:w="1476"/>
+            <w:tcMar>
+              <w:top w:w="80" w:type="dxa"/>
+              <w:start w:w="120" w:type="dxa"/>
+              <w:bottom w:w="80" w:type="dxa"/>
+              <w:end w:w="120" w:type="dxa"/>
+            </w:tcMar>
+            <w:vAlign w:val="center"/>
+          </w:tcPr>
+          <w:p>
+            <w:pPr>
+              <w:spacing w:after="0"/>
+              <w:jc w:val="center"/>
+            </w:pPr>
+            <w:r>
+              <w:rPr>
+                <w:rFonts w:ascii="Malgun Gothic" w:hAnsi="Malgun Gothic" w:eastAsia="Malgun Gothic"/>
+                <w:b w:val="0"/>
+                <w:sz w:val="20"/>
+              </w:rPr>
+              <w:t>-</w:t>
+            </w:r>
+          </w:p>
+        </w:tc>
+      </w:tr>
+      <w:tr>
+        <w:tc>
+          <w:tcPr>
+            <w:tcW w:type="dxa" w:w="1476"/>
+            <w:tcMar>
+              <w:top w:w="80" w:type="dxa"/>
+              <w:start w:w="120" w:type="dxa"/>
+              <w:bottom w:w="80" w:type="dxa"/>
+              <w:end w:w="120" w:type="dxa"/>
+            </w:tcMar>
+            <w:vAlign w:val="center"/>
+          </w:tcPr>
+          <w:p>
+            <w:pPr>
+              <w:spacing w:after="0"/>
+              <w:jc w:val="left"/>
+            </w:pPr>
+            <w:r>
+              <w:rPr>
+                <w:rFonts w:ascii="Malgun Gothic" w:hAnsi="Malgun Gothic" w:eastAsia="Malgun Gothic"/>
+                <w:b w:val="0"/>
+                <w:sz w:val="20"/>
+              </w:rPr>
+              <w:t>일별 종가 기준 -10%</w:t>
+            </w:r>
+          </w:p>
+        </w:tc>
+        <w:tc>
+          <w:tcPr>
+            <w:tcW w:type="dxa" w:w="1476"/>
+            <w:tcMar>
+              <w:top w:w="80" w:type="dxa"/>
+              <w:start w:w="120" w:type="dxa"/>
+              <w:bottom w:w="80" w:type="dxa"/>
+              <w:end w:w="120" w:type="dxa"/>
+            </w:tcMar>
+            <w:vAlign w:val="center"/>
+          </w:tcPr>
+          <w:p>
+            <w:pPr>
+              <w:spacing w:after="0"/>
+              <w:jc w:val="center"/>
+            </w:pPr>
+            <w:r>
+              <w:rPr>
+                <w:rFonts w:ascii="Malgun Gothic" w:hAnsi="Malgun Gothic" w:eastAsia="Malgun Gothic"/>
+                <w:b w:val="0"/>
+                <w:sz w:val="20"/>
+              </w:rPr>
+              <w:t>47.5%</w:t>
+            </w:r>
+          </w:p>
+        </w:tc>
+        <w:tc>
+          <w:tcPr>
+            <w:tcW w:type="dxa" w:w="1476"/>
+            <w:tcMar>
+              <w:top w:w="80" w:type="dxa"/>
+              <w:start w:w="120" w:type="dxa"/>
+              <w:bottom w:w="80" w:type="dxa"/>
+              <w:end w:w="120" w:type="dxa"/>
+            </w:tcMar>
+            <w:vAlign w:val="center"/>
+          </w:tcPr>
+          <w:p>
+            <w:pPr>
+              <w:spacing w:after="0"/>
+              <w:jc w:val="center"/>
+            </w:pPr>
+            <w:r>
+              <w:rPr>
+                <w:rFonts w:ascii="Malgun Gothic" w:hAnsi="Malgun Gothic" w:eastAsia="Malgun Gothic"/>
+                <w:b w:val="0"/>
+                <w:sz w:val="20"/>
+              </w:rPr>
+              <w:t>-42.2%</w:t>
+            </w:r>
+          </w:p>
+        </w:tc>
+        <w:tc>
+          <w:tcPr>
+            <w:tcW w:type="dxa" w:w="1476"/>
+            <w:tcMar>
+              <w:top w:w="80" w:type="dxa"/>
+              <w:start w:w="120" w:type="dxa"/>
+              <w:bottom w:w="80" w:type="dxa"/>
+              <w:end w:w="120" w:type="dxa"/>
+            </w:tcMar>
+            <w:vAlign w:val="center"/>
+          </w:tcPr>
+          <w:p>
+            <w:pPr>
+              <w:spacing w:after="0"/>
+              <w:jc w:val="center"/>
+            </w:pPr>
+            <w:r>
+              <w:rPr>
+                <w:rFonts w:ascii="Malgun Gothic" w:hAnsi="Malgun Gothic" w:eastAsia="Malgun Gothic"/>
+                <w:b w:val="0"/>
+                <w:sz w:val="20"/>
+              </w:rPr>
+              <w:t>6.86</w:t>
+            </w:r>
+          </w:p>
+        </w:tc>
+        <w:tc>
+          <w:tcPr>
+            <w:tcW w:type="dxa" w:w="1476"/>
+            <w:tcMar>
+              <w:top w:w="80" w:type="dxa"/>
+              <w:start w:w="120" w:type="dxa"/>
+              <w:bottom w:w="80" w:type="dxa"/>
+              <w:end w:w="120" w:type="dxa"/>
+            </w:tcMar>
+            <w:vAlign w:val="center"/>
+          </w:tcPr>
+          <w:p>
+            <w:pPr>
+              <w:spacing w:after="0"/>
+              <w:jc w:val="center"/>
+            </w:pPr>
+            <w:r>
+              <w:rPr>
+                <w:rFonts w:ascii="Malgun Gothic" w:hAnsi="Malgun Gothic" w:eastAsia="Malgun Gothic"/>
+                <w:b w:val="0"/>
+                <w:sz w:val="20"/>
+              </w:rPr>
+              <w:t>35.4%</w:t>
+            </w:r>
+          </w:p>
+        </w:tc>
+        <w:tc>
+          <w:tcPr>
+            <w:tcW w:type="dxa" w:w="1476"/>
+            <w:tcMar>
+              <w:top w:w="80" w:type="dxa"/>
+              <w:start w:w="120" w:type="dxa"/>
+              <w:bottom w:w="80" w:type="dxa"/>
+              <w:end w:w="120" w:type="dxa"/>
+            </w:tcMar>
+            <w:vAlign w:val="center"/>
+          </w:tcPr>
+          <w:p>
+            <w:pPr>
+              <w:spacing w:after="0"/>
+              <w:jc w:val="center"/>
+            </w:pPr>
+            <w:r>
+              <w:rPr>
+                <w:rFonts w:ascii="Malgun Gothic" w:hAnsi="Malgun Gothic" w:eastAsia="Malgun Gothic"/>
+                <w:b w:val="0"/>
+                <w:sz w:val="20"/>
+              </w:rPr>
+              <w:t>41.9%</w:t>
+            </w:r>
+          </w:p>
+        </w:tc>
+      </w:tr>
+      <w:tr>
+        <w:tc>
+          <w:tcPr>
+            <w:tcW w:type="dxa" w:w="1476"/>
+            <w:tcMar>
+              <w:top w:w="80" w:type="dxa"/>
+              <w:start w:w="120" w:type="dxa"/>
+              <w:bottom w:w="80" w:type="dxa"/>
+              <w:end w:w="120" w:type="dxa"/>
+            </w:tcMar>
+            <w:vAlign w:val="center"/>
+          </w:tcPr>
+          <w:p>
+            <w:pPr>
+              <w:spacing w:after="0"/>
+              <w:jc w:val="left"/>
+            </w:pPr>
+            <w:r>
+              <w:rPr>
+                <w:rFonts w:ascii="Malgun Gothic" w:hAnsi="Malgun Gothic" w:eastAsia="Malgun Gothic"/>
+                <w:b w:val="0"/>
+                <w:sz w:val="20"/>
+              </w:rPr>
+              <w:t>일별 종가 기준 -20%</w:t>
+            </w:r>
+          </w:p>
+        </w:tc>
+        <w:tc>
+          <w:tcPr>
+            <w:tcW w:type="dxa" w:w="1476"/>
+            <w:tcMar>
+              <w:top w:w="80" w:type="dxa"/>
+              <w:start w:w="120" w:type="dxa"/>
+              <w:bottom w:w="80" w:type="dxa"/>
+              <w:end w:w="120" w:type="dxa"/>
+            </w:tcMar>
+            <w:vAlign w:val="center"/>
+          </w:tcPr>
+          <w:p>
+            <w:pPr>
+              <w:spacing w:after="0"/>
+              <w:jc w:val="center"/>
+            </w:pPr>
+            <w:r>
+              <w:rPr>
+                <w:rFonts w:ascii="Malgun Gothic" w:hAnsi="Malgun Gothic" w:eastAsia="Malgun Gothic"/>
+                <w:b w:val="0"/>
+                <w:sz w:val="20"/>
+              </w:rPr>
+              <w:t>47.9%</w:t>
+            </w:r>
+          </w:p>
+        </w:tc>
+        <w:tc>
+          <w:tcPr>
+            <w:tcW w:type="dxa" w:w="1476"/>
+            <w:tcMar>
+              <w:top w:w="80" w:type="dxa"/>
+              <w:start w:w="120" w:type="dxa"/>
+              <w:bottom w:w="80" w:type="dxa"/>
+              <w:end w:w="120" w:type="dxa"/>
+            </w:tcMar>
+            <w:vAlign w:val="center"/>
+          </w:tcPr>
+          <w:p>
+            <w:pPr>
+              <w:spacing w:after="0"/>
+              <w:jc w:val="center"/>
+            </w:pPr>
+            <w:r>
+              <w:rPr>
+                <w:rFonts w:ascii="Malgun Gothic" w:hAnsi="Malgun Gothic" w:eastAsia="Malgun Gothic"/>
+                <w:b w:val="0"/>
+                <w:sz w:val="20"/>
+              </w:rPr>
+              <w:t>-49.8%</w:t>
+            </w:r>
+          </w:p>
+        </w:tc>
+        <w:tc>
+          <w:tcPr>
+            <w:tcW w:type="dxa" w:w="1476"/>
+            <w:tcMar>
+              <w:top w:w="80" w:type="dxa"/>
+              <w:start w:w="120" w:type="dxa"/>
+              <w:bottom w:w="80" w:type="dxa"/>
+              <w:end w:w="120" w:type="dxa"/>
+            </w:tcMar>
+            <w:vAlign w:val="center"/>
+          </w:tcPr>
+          <w:p>
+            <w:pPr>
+              <w:spacing w:after="0"/>
+              <w:jc w:val="center"/>
+            </w:pPr>
+            <w:r>
+              <w:rPr>
+                <w:rFonts w:ascii="Malgun Gothic" w:hAnsi="Malgun Gothic" w:eastAsia="Malgun Gothic"/>
+                <w:b w:val="0"/>
+                <w:sz w:val="20"/>
+              </w:rPr>
+              <w:t>6.50</w:t>
+            </w:r>
+          </w:p>
+        </w:tc>
+        <w:tc>
+          <w:tcPr>
+            <w:tcW w:type="dxa" w:w="1476"/>
+            <w:tcMar>
+              <w:top w:w="80" w:type="dxa"/>
+              <w:start w:w="120" w:type="dxa"/>
+              <w:bottom w:w="80" w:type="dxa"/>
+              <w:end w:w="120" w:type="dxa"/>
+            </w:tcMar>
+            <w:vAlign w:val="center"/>
+          </w:tcPr>
+          <w:p>
+            <w:pPr>
+              <w:spacing w:after="0"/>
+              <w:jc w:val="center"/>
+            </w:pPr>
+            <w:r>
+              <w:rPr>
+                <w:rFonts w:ascii="Malgun Gothic" w:hAnsi="Malgun Gothic" w:eastAsia="Malgun Gothic"/>
+                <w:b w:val="0"/>
+                <w:sz w:val="20"/>
+              </w:rPr>
+              <w:t>16.3%</w:t>
+            </w:r>
+          </w:p>
+        </w:tc>
+        <w:tc>
+          <w:tcPr>
+            <w:tcW w:type="dxa" w:w="1476"/>
+            <w:tcMar>
+              <w:top w:w="80" w:type="dxa"/>
+              <w:start w:w="120" w:type="dxa"/>
+              <w:bottom w:w="80" w:type="dxa"/>
+              <w:end w:w="120" w:type="dxa"/>
+            </w:tcMar>
+            <w:vAlign w:val="center"/>
+          </w:tcPr>
+          <w:p>
+            <w:pPr>
+              <w:spacing w:after="0"/>
+              <w:jc w:val="center"/>
+            </w:pPr>
+            <w:r>
+              <w:rPr>
+                <w:rFonts w:ascii="Malgun Gothic" w:hAnsi="Malgun Gothic" w:eastAsia="Malgun Gothic"/>
+                <w:b w:val="0"/>
+                <w:sz w:val="20"/>
+              </w:rPr>
+              <w:t>40.0%</w:t>
+            </w:r>
+          </w:p>
+        </w:tc>
+      </w:tr>
+      <w:tr>
+        <w:tc>
+          <w:tcPr>
+            <w:tcW w:type="dxa" w:w="1476"/>
+            <w:tcMar>
+              <w:top w:w="80" w:type="dxa"/>
+              <w:start w:w="120" w:type="dxa"/>
+              <w:bottom w:w="80" w:type="dxa"/>
+              <w:end w:w="120" w:type="dxa"/>
+            </w:tcMar>
+            <w:vAlign w:val="center"/>
+          </w:tcPr>
+          <w:p>
+            <w:pPr>
+              <w:spacing w:after="0"/>
+              <w:jc w:val="left"/>
+            </w:pPr>
+            <w:r>
+              <w:rPr>
+                <w:rFonts w:ascii="Malgun Gothic" w:hAnsi="Malgun Gothic" w:eastAsia="Malgun Gothic"/>
+                <w:b w:val="0"/>
+                <w:sz w:val="20"/>
+              </w:rPr>
+              <w:t>일별 종가 기준 -30%</w:t>
+            </w:r>
+          </w:p>
+        </w:tc>
+        <w:tc>
+          <w:tcPr>
+            <w:tcW w:type="dxa" w:w="1476"/>
+            <w:tcMar>
+              <w:top w:w="80" w:type="dxa"/>
+              <w:start w:w="120" w:type="dxa"/>
+              <w:bottom w:w="80" w:type="dxa"/>
+              <w:end w:w="120" w:type="dxa"/>
+            </w:tcMar>
+            <w:vAlign w:val="center"/>
+          </w:tcPr>
+          <w:p>
+            <w:pPr>
+              <w:spacing w:after="0"/>
+              <w:jc w:val="center"/>
+            </w:pPr>
+            <w:r>
+              <w:rPr>
+                <w:rFonts w:ascii="Malgun Gothic" w:hAnsi="Malgun Gothic" w:eastAsia="Malgun Gothic"/>
+                <w:b w:val="0"/>
+                <w:sz w:val="20"/>
+              </w:rPr>
+              <w:t>46.5%</w:t>
+            </w:r>
+          </w:p>
+        </w:tc>
+        <w:tc>
+          <w:tcPr>
+            <w:tcW w:type="dxa" w:w="1476"/>
+            <w:tcMar>
+              <w:top w:w="80" w:type="dxa"/>
+              <w:start w:w="120" w:type="dxa"/>
+              <w:bottom w:w="80" w:type="dxa"/>
+              <w:end w:w="120" w:type="dxa"/>
+            </w:tcMar>
+            <w:vAlign w:val="center"/>
+          </w:tcPr>
+          <w:p>
+            <w:pPr>
+              <w:spacing w:after="0"/>
+              <w:jc w:val="center"/>
+            </w:pPr>
+            <w:r>
+              <w:rPr>
+                <w:rFonts w:ascii="Malgun Gothic" w:hAnsi="Malgun Gothic" w:eastAsia="Malgun Gothic"/>
+                <w:b w:val="0"/>
+                <w:sz w:val="20"/>
+              </w:rPr>
+              <w:t>-50.9%</w:t>
+            </w:r>
+          </w:p>
+        </w:tc>
+        <w:tc>
+          <w:tcPr>
+            <w:tcW w:type="dxa" w:w="1476"/>
+            <w:tcMar>
+              <w:top w:w="80" w:type="dxa"/>
+              <w:start w:w="120" w:type="dxa"/>
+              <w:bottom w:w="80" w:type="dxa"/>
+              <w:end w:w="120" w:type="dxa"/>
+            </w:tcMar>
+            <w:vAlign w:val="center"/>
+          </w:tcPr>
+          <w:p>
+            <w:pPr>
+              <w:spacing w:after="0"/>
+              <w:jc w:val="center"/>
+            </w:pPr>
+            <w:r>
+              <w:rPr>
+                <w:rFonts w:ascii="Malgun Gothic" w:hAnsi="Malgun Gothic" w:eastAsia="Malgun Gothic"/>
+                <w:b w:val="0"/>
+                <w:sz w:val="20"/>
+              </w:rPr>
+              <w:t>6.22</w:t>
+            </w:r>
+          </w:p>
+        </w:tc>
+        <w:tc>
+          <w:tcPr>
+            <w:tcW w:type="dxa" w:w="1476"/>
+            <w:tcMar>
+              <w:top w:w="80" w:type="dxa"/>
+              <w:start w:w="120" w:type="dxa"/>
+              <w:bottom w:w="80" w:type="dxa"/>
+              <w:end w:w="120" w:type="dxa"/>
+            </w:tcMar>
+            <w:vAlign w:val="center"/>
+          </w:tcPr>
+          <w:p>
+            <w:pPr>
+              <w:spacing w:after="0"/>
+              <w:jc w:val="center"/>
+            </w:pPr>
+            <w:r>
+              <w:rPr>
+                <w:rFonts w:ascii="Malgun Gothic" w:hAnsi="Malgun Gothic" w:eastAsia="Malgun Gothic"/>
+                <w:b w:val="0"/>
+                <w:sz w:val="20"/>
+              </w:rPr>
+              <w:t>7.8%</w:t>
+            </w:r>
+          </w:p>
+        </w:tc>
+        <w:tc>
+          <w:tcPr>
+            <w:tcW w:type="dxa" w:w="1476"/>
+            <w:tcMar>
+              <w:top w:w="80" w:type="dxa"/>
+              <w:start w:w="120" w:type="dxa"/>
+              <w:bottom w:w="80" w:type="dxa"/>
+              <w:end w:w="120" w:type="dxa"/>
+            </w:tcMar>
+            <w:vAlign w:val="center"/>
+          </w:tcPr>
+          <w:p>
+            <w:pPr>
+              <w:spacing w:after="0"/>
+              <w:jc w:val="center"/>
+            </w:pPr>
+            <w:r>
+              <w:rPr>
+                <w:rFonts w:ascii="Malgun Gothic" w:hAnsi="Malgun Gothic" w:eastAsia="Malgun Gothic"/>
+                <w:b w:val="0"/>
+                <w:sz w:val="20"/>
+              </w:rPr>
+              <w:t>37.3%</w:t>
+            </w:r>
+          </w:p>
+        </w:tc>
+      </w:tr>
+    </w:tbl>
+    <w:p>
+      <w:pPr>
+        <w:spacing w:after="0"/>
+      </w:pPr>
+    </w:p>
+    <w:p>
+      <w:pPr>
+        <w:keepNext/>
+        <w:spacing w:before="120" w:after="60"/>
+        <w:jc w:val="center"/>
+      </w:pPr>
+      <w:r>
+        <w:drawing>
+          <wp:inline xmlns:a="http://schemas.openxmlformats.org/drawingml/2006/main" xmlns:pic="http://schemas.openxmlformats.org/drawingml/2006/picture">
+            <wp:extent cx="5577840" cy="3253740"/>
+            <wp:docPr id="6" name="Picture 6"/>
+            <wp:cNvGraphicFramePr>
+              <a:graphicFrameLocks noChangeAspect="1"/>
+            </wp:cNvGraphicFramePr>
+            <a:graphic>
+              <a:graphicData uri="http://schemas.openxmlformats.org/drawingml/2006/picture">
+                <pic:pic>
+                  <pic:nvPicPr>
+                    <pic:cNvPr id="0" name="12_stop_loss_daily_close_audit.png"/>
+                    <pic:cNvPicPr/>
+                  </pic:nvPicPr>
+                  <pic:blipFill>
+                    <a:blip r:embed="rId14"/>
+                    <a:stretch>
+                      <a:fillRect/>
+                    </a:stretch>
+                  </pic:blipFill>
+                  <pic:spPr>
+                    <a:xfrm>
+                      <a:off x="0" y="0"/>
+                      <a:ext cx="5577840" cy="3253740"/>
+                    </a:xfrm>
+                    <a:prstGeom prst="rect"/>
+                  </pic:spPr>
+                </pic:pic>
+              </a:graphicData>
+            </a:graphic>
+          </wp:inline>
+        </w:drawing>
+      </w:r>
+    </w:p>
+    <w:p>
+      <w:pPr>
+        <w:pStyle w:val="FigureCaption"/>
+        <w:jc w:val="center"/>
+      </w:pPr>
+      <w:r>
+        <w:rPr>
+          <w:rFonts w:ascii="Malgun Gothic" w:hAnsi="Malgun Gothic" w:eastAsia="Malgun Gothic"/>
+          <w:color w:val="595959"/>
+          <w:sz w:val="18"/>
+        </w:rPr>
+        <w:t>그림 5. 일별 종가 손절 규칙의 조건부 표본 비교</w:t>
+      </w:r>
+    </w:p>
+    <w:p>
+      <w:pPr>
+        <w:spacing w:after="160" w:line="320" w:lineRule="auto"/>
+      </w:pPr>
+      <w:r>
+        <w:rPr>
+          <w:rFonts w:ascii="Malgun Gothic" w:hAnsi="Malgun Gothic" w:eastAsia="Malgun Gothic"/>
+          <w:sz w:val="22"/>
+        </w:rPr>
+        <w:t>-10% 규칙은 최대낙폭을 7.6%p 낮췄다. 하지만 이 결과를 ‘-10%가 최적 손절선’이라고 읽으면 안 된다. 손절이 발생한 보유-월은 35.4%였고, 그중 41.9%는 월말까지 계속 보유했을 때 손절 청산가보다 높은 가격으로 끝났다. 손절은 상당수의 반등을 포기하는 대신, 큰 낙폭 구간에서 현금으로 이동한 규칙이다.</w:t>
+      </w:r>
+    </w:p>
+    <w:p>
+      <w:pPr>
+        <w:spacing w:after="160" w:line="320" w:lineRule="auto"/>
+      </w:pPr>
+      <w:r>
+        <w:rPr>
+          <w:rFonts w:ascii="Malgun Gothic" w:hAnsi="Malgun Gothic" w:eastAsia="Malgun Gothic"/>
+          <w:sz w:val="22"/>
+        </w:rPr>
+        <w:t>-20%는 CAGR이 47.9%로 가장 높게 보이지만 MDD는 손절 없음과 거의 같다. -30%는 CAGR과 MDD가 모두 나빠졌다. 기준을 느슨하게 만들수록 손절 횟수는 줄지만 보호 효과도 사라진다. 기준을 엄격하게 만들수록 MDD는 줄어들 수 있지만, 반등 종목을 더 많이 놓친다. 이 결과에는 단조롭게 좋은 손절선이 없었다.</w:t>
+      </w:r>
+    </w:p>
+    <w:p>
+      <w:pPr>
+        <w:spacing w:after="160" w:line="320" w:lineRule="auto"/>
+      </w:pPr>
+      <w:r>
+        <w:rPr>
+          <w:rFonts w:ascii="Malgun Gothic" w:hAnsi="Malgun Gothic" w:eastAsia="Malgun Gothic"/>
+          <w:sz w:val="22"/>
+        </w:rPr>
+        <w:t>여기서 더 중요한 숫자는 41.9%다. 손절된 종목 열 개 중 네 개 이상이 그 달 말에는 손절 청산가보다 높았다. 이 비율은 손절이 틀렸다는 뜻이 아니다. 손절은 개별 종목의 방향을 맞히는 규칙이 아니라, 포트폴리오가 감당할 수 없는 손실 경로를 잘라내는 규칙이라는 뜻이다. 따라서 손절의 평가는 평균 수익률 하나가 아니라 MDD, 손절 빈도, 반등 포기, 현금 체류기간을 함께 놓고 해야 한다.</w:t>
+      </w:r>
+    </w:p>
+    <w:p>
+      <w:pPr>
+        <w:spacing w:after="160" w:line="320" w:lineRule="auto"/>
+      </w:pPr>
+      <w:r>
+        <w:rPr>
+          <w:rFonts w:ascii="Malgun Gothic" w:hAnsi="Malgun Gothic" w:eastAsia="Malgun Gothic"/>
+          <w:sz w:val="22"/>
+        </w:rPr>
+        <w:t>손절 연구에는 이 글의 다른 한계보다 더 엄격한 경계가 있다. 일별 종가 기준의 다음 거래일 청산은 장중 손절 주문과 다르다. 갭 하락, 하한가, 거래정지, 호가 스프레드가 큰 날에는 실제 청산이 더 늦거나 더 불리할 수 있다. 종료사건의 현금 결제값도 이 조건부 표본에서는 해결되지 않는다. 그래서 이 결과는 ‘손절매를 쓰라’는 추천이 아니라, 소형주 전략의 손실을 통제하는 방법을 논할 때 어떤 데이터를 추가해야 하는지 보여 주는 첫 번째 반증이다.</w:t>
+      </w:r>
+    </w:p>
+    <w:p>
+      <w:pPr>
+        <w:pStyle w:val="Heading2"/>
+      </w:pPr>
+      <w:r>
         <w:t>이 글이 아직 투자 권유가 아닌 이유</w:t>
       </w:r>
     </w:p>
@@ -2625,6 +3604,20 @@
           <w:sz w:val="19"/>
         </w:rPr>
         <w:t>참여율 민감도 실험: https://github.com/Rowoon-Lee5/metric_studio_by_moon/blob/main/experiments/participation_sensitivity.py</w:t>
+      </w:r>
+    </w:p>
+    <w:p>
+      <w:pPr>
+        <w:pStyle w:val="ListBullet"/>
+        <w:spacing w:after="80"/>
+      </w:pPr>
+      <w:r>
+        <w:rPr>
+          <w:rFonts w:ascii="Malgun Gothic" w:hAnsi="Malgun Gothic" w:eastAsia="Malgun Gothic"/>
+          <w:color w:val="373737"/>
+          <w:sz w:val="19"/>
+        </w:rPr>
+        <w:t>일별 종가 손절 감사: https://github.com/Rowoon-Lee5/metric_studio_by_moon/blob/main/experiments/stop_loss_daily_close_audit.py</w:t>
       </w:r>
     </w:p>
     <w:p>

</xml_diff>